<commit_message>
Submotivo rescisao, editor completo e novo template BUQ
</commit_message>
<xml_diff>
--- a/template_notificacao.docx
+++ b/template_notificacao.docx
@@ -6,280 +6,289 @@
     <w:p>
       <w:pPr>
         <w:widowControl w:val="0"/>
-        <w:ind w:left="-425" w:right="-432"/>
-        <w:jc w:val="right"/>
-        <w:rPr>
-          <w:rFonts w:ascii="Roboto" w:eastAsia="Roboto" w:hAnsi="Roboto" w:cs="Roboto"/>
-          <w:b/>
-          <w:bCs/>
-          <w:color w:val="2E3C4F"/>
-          <w:sz w:val="24"/>
-          <w:szCs w:val="24"/>
-        </w:rPr>
-      </w:pPr>
-      <w:r>
-        <w:rPr>
-          <w:rFonts w:ascii="Roboto" w:eastAsia="Roboto" w:hAnsi="Roboto" w:cs="Roboto"/>
-          <w:b/>
-          <w:bCs/>
-          <w:color w:val="2E3C4F"/>
-          <w:sz w:val="24"/>
-          <w:szCs w:val="24"/>
-        </w:rPr>
-        <w:t>A NOTIFICADA</w:t>
-      </w:r>
-    </w:p>
-    <w:p>
-      <w:pPr>
-        <w:widowControl w:val="0"/>
-        <w:ind w:left="-425" w:right="-432"/>
-        <w:jc w:val="right"/>
-        <w:rPr>
-          <w:rFonts w:ascii="Roboto" w:eastAsia="Roboto" w:hAnsi="Roboto" w:cs="Roboto"/>
-          <w:color w:val="2E3C4F"/>
-          <w:sz w:val="24"/>
-          <w:szCs w:val="24"/>
-        </w:rPr>
-      </w:pPr>
-      <w:r>
-        <w:rPr>
-          <w:rFonts w:ascii="Roboto" w:eastAsia="Roboto" w:hAnsi="Roboto" w:cs="Roboto"/>
-          <w:b/>
-          <w:bCs/>
-          <w:color w:val="2E3C4F"/>
-          <w:sz w:val="24"/>
-          <w:szCs w:val="24"/>
-        </w:rPr>
-        <w:t>SANKHYA JIVA TECNOLOGIA E INOVAÇÃO LTDA. (Sankhya)</w:t>
-      </w:r>
-    </w:p>
-    <w:p>
-      <w:pPr>
-        <w:widowControl w:val="0"/>
-        <w:ind w:left="-425" w:right="-432"/>
-        <w:jc w:val="right"/>
-        <w:rPr>
-          <w:rFonts w:ascii="Roboto" w:eastAsia="Roboto" w:hAnsi="Roboto" w:cs="Roboto"/>
-          <w:color w:val="2E3C4F"/>
-          <w:sz w:val="16"/>
-          <w:szCs w:val="16"/>
-        </w:rPr>
-      </w:pPr>
-      <w:r>
-        <w:rPr>
-          <w:rFonts w:ascii="Roboto" w:eastAsia="Roboto" w:hAnsi="Roboto" w:cs="Roboto"/>
-          <w:color w:val="2E3C4F"/>
-          <w:sz w:val="16"/>
-          <w:szCs w:val="16"/>
-        </w:rPr>
-        <w:t>Avenida Marcos Freitas Costa, nº 369, bairro Daniel Fonseca.</w:t>
-      </w:r>
-    </w:p>
-    <w:p>
-      <w:pPr>
-        <w:widowControl w:val="0"/>
-        <w:ind w:left="-425" w:right="-432"/>
-        <w:jc w:val="right"/>
-        <w:rPr>
-          <w:rFonts w:ascii="Roboto" w:eastAsia="Roboto" w:hAnsi="Roboto" w:cs="Roboto"/>
-          <w:color w:val="2E3C4F"/>
-          <w:sz w:val="16"/>
-          <w:szCs w:val="16"/>
-        </w:rPr>
-      </w:pPr>
-      <w:r>
-        <w:rPr>
-          <w:rFonts w:ascii="Roboto" w:eastAsia="Roboto" w:hAnsi="Roboto" w:cs="Roboto"/>
-          <w:color w:val="2E3C4F"/>
-          <w:sz w:val="16"/>
-          <w:szCs w:val="16"/>
-        </w:rPr>
-        <w:t>CEP 38400-328, Uberlândia/MG.</w:t>
-      </w:r>
-    </w:p>
-    <w:p>
-      <w:pPr>
-        <w:ind w:left="-425" w:right="-432"/>
-        <w:jc w:val="right"/>
-        <w:rPr>
-          <w:rFonts w:ascii="Roboto" w:eastAsia="Roboto" w:hAnsi="Roboto" w:cs="Roboto"/>
-          <w:color w:val="2E3C4F"/>
-          <w:sz w:val="16"/>
-          <w:szCs w:val="16"/>
-        </w:rPr>
-      </w:pPr>
-      <w:r>
-        <w:rPr>
-          <w:rFonts w:ascii="Roboto" w:eastAsia="Roboto" w:hAnsi="Roboto" w:cs="Roboto"/>
-          <w:color w:val="2E3C4F"/>
-          <w:sz w:val="16"/>
-          <w:szCs w:val="16"/>
-        </w:rPr>
-        <w:t>CNPJ nº 26.314.062/0001-61.</w:t>
-      </w:r>
-    </w:p>
-    <w:p>
-      <w:pPr>
-        <w:ind w:left="-425" w:right="-432"/>
-        <w:jc w:val="right"/>
-        <w:rPr>
-          <w:rFonts w:ascii="Roboto" w:eastAsia="Roboto" w:hAnsi="Roboto" w:cs="Roboto"/>
-          <w:b/>
-          <w:bCs/>
-          <w:color w:val="2E3C4F"/>
-          <w:sz w:val="24"/>
-          <w:szCs w:val="24"/>
-        </w:rPr>
-      </w:pPr>
-    </w:p>
-    <w:p>
-      <w:pPr>
-        <w:ind w:left="-425" w:right="-432"/>
-        <w:jc w:val="right"/>
-        <w:rPr>
-          <w:rFonts w:ascii="Roboto" w:eastAsia="Roboto" w:hAnsi="Roboto" w:cs="Roboto"/>
-          <w:b/>
-          <w:bCs/>
-          <w:color w:val="2E3C4F"/>
-          <w:sz w:val="24"/>
-          <w:szCs w:val="24"/>
-        </w:rPr>
-      </w:pPr>
-      <w:r>
-        <w:rPr>
-          <w:rFonts w:ascii="Roboto" w:eastAsia="Roboto" w:hAnsi="Roboto" w:cs="Roboto"/>
-          <w:b/>
-          <w:bCs/>
-          <w:color w:val="2E3C4F"/>
-          <w:sz w:val="24"/>
-          <w:szCs w:val="24"/>
-        </w:rPr>
-        <w:t>A NOTIFICANTE</w:t>
-      </w:r>
-    </w:p>
-    <w:p>
-      <w:pPr>
-        <w:ind w:left="-425" w:right="-432"/>
-        <w:jc w:val="right"/>
-        <w:rPr>
-          <w:rFonts w:ascii="Roboto" w:eastAsia="Roboto" w:hAnsi="Roboto" w:cs="Roboto"/>
-          <w:b/>
-          <w:bCs/>
-          <w:color w:val="2E3C4F"/>
-          <w:sz w:val="24"/>
-          <w:szCs w:val="24"/>
-        </w:rPr>
-      </w:pPr>
-      <w:r>
-        <w:rPr>
-          <w:rFonts w:ascii="Roboto" w:eastAsia="Roboto" w:hAnsi="Roboto" w:cs="Roboto"/>
-          <w:b/>
-          <w:bCs/>
-          <w:color w:val="2E3C4F"/>
-          <w:sz w:val="24"/>
-          <w:szCs w:val="24"/>
-        </w:rPr>
-        <w:t>ROTAMAR TERMINAL PESQUEIRO SPE LTDA (ASOEC),</w:t>
-      </w:r>
-    </w:p>
-    <w:p>
-      <w:pPr>
-        <w:widowControl w:val="0"/>
-        <w:pBdr>
-          <w:top w:val="nil"/>
-          <w:left w:val="nil"/>
-          <w:bottom w:val="nil"/>
-          <w:right w:val="nil"/>
-          <w:between w:val="nil"/>
-        </w:pBdr>
-        <w:ind w:left="-425" w:right="-432"/>
-        <w:jc w:val="right"/>
-        <w:rPr>
-          <w:rFonts w:ascii="Roboto" w:eastAsia="Roboto" w:hAnsi="Roboto" w:cs="Roboto"/>
-          <w:color w:val="2E3C4F"/>
-          <w:sz w:val="16"/>
-          <w:szCs w:val="16"/>
-        </w:rPr>
-      </w:pPr>
-      <w:r>
-        <w:rPr>
-          <w:rFonts w:ascii="Roboto" w:eastAsia="Roboto" w:hAnsi="Roboto" w:cs="Roboto"/>
-          <w:color w:val="2E3C4F"/>
-          <w:sz w:val="16"/>
-          <w:szCs w:val="16"/>
-        </w:rPr>
-        <w:t xml:space="preserve">Rua Presidente João Pessoa, nº 496, Centro.  </w:t>
-      </w:r>
-    </w:p>
-    <w:p>
-      <w:pPr>
-        <w:widowControl w:val="0"/>
-        <w:pBdr>
-          <w:top w:val="nil"/>
-          <w:left w:val="nil"/>
-          <w:bottom w:val="nil"/>
-          <w:right w:val="nil"/>
-          <w:between w:val="nil"/>
-        </w:pBdr>
-        <w:ind w:left="-425" w:right="-432"/>
-        <w:jc w:val="right"/>
-        <w:rPr>
-          <w:rFonts w:ascii="Roboto" w:eastAsia="Roboto" w:hAnsi="Roboto" w:cs="Roboto"/>
-          <w:color w:val="2E3C4F"/>
-          <w:sz w:val="16"/>
-          <w:szCs w:val="16"/>
-        </w:rPr>
-      </w:pPr>
-      <w:r>
-        <w:rPr>
-          <w:rFonts w:ascii="Roboto" w:eastAsia="Roboto" w:hAnsi="Roboto" w:cs="Roboto"/>
-          <w:color w:val="2E3C4F"/>
-          <w:sz w:val="16"/>
-          <w:szCs w:val="16"/>
-        </w:rPr>
-        <w:t>CEP 58.100-100, Cabedelo/PB.</w:t>
-      </w:r>
-    </w:p>
-    <w:p>
-      <w:pPr>
-        <w:widowControl w:val="0"/>
-        <w:pBdr>
-          <w:top w:val="nil"/>
-          <w:left w:val="nil"/>
-          <w:bottom w:val="nil"/>
-          <w:right w:val="nil"/>
-          <w:between w:val="nil"/>
-        </w:pBdr>
-        <w:ind w:left="-425" w:right="-432"/>
+        <w:jc w:val="both"/>
+        <w:rPr>
+          <w:rFonts w:ascii="Roboto" w:eastAsia="Roboto" w:hAnsi="Roboto" w:cs="Roboto"/>
+          <w:color w:val="2E3C4F"/>
+          <w:sz w:val="24"/>
+          <w:szCs w:val="24"/>
+        </w:rPr>
+      </w:pPr>
+      <w:r>
+        <w:rPr>
+          <w:rFonts w:ascii="Roboto" w:eastAsia="Roboto" w:hAnsi="Roboto" w:cs="Roboto"/>
+          <w:color w:val="2E3C4F"/>
+          <w:sz w:val="24"/>
+          <w:szCs w:val="24"/>
+        </w:rPr>
+        <w:t>Uberlândia/MG, 21 de junho de 2026.</w:t>
+      </w:r>
+    </w:p>
+    <w:p>
+      <w:pPr>
+        <w:widowControl w:val="0"/>
+        <w:rPr>
+          <w:rFonts w:ascii="Roboto" w:eastAsia="Roboto" w:hAnsi="Roboto" w:cs="Roboto"/>
+          <w:color w:val="2E3C4F"/>
+          <w:sz w:val="24"/>
+          <w:szCs w:val="24"/>
+        </w:rPr>
+      </w:pPr>
+    </w:p>
+    <w:p>
+      <w:pPr>
+        <w:widowControl w:val="0"/>
         <w:jc w:val="right"/>
         <w:rPr>
           <w:rFonts w:ascii="Roboto" w:eastAsia="Roboto" w:hAnsi="Roboto" w:cs="Roboto"/>
           <w:color w:val="2E3C4F"/>
           <w:sz w:val="20"/>
           <w:szCs w:val="20"/>
-          <w:highlight w:val="white"/>
-        </w:rPr>
-      </w:pPr>
-      <w:r>
-        <w:rPr>
-          <w:rFonts w:ascii="Roboto" w:eastAsia="Roboto" w:hAnsi="Roboto" w:cs="Roboto"/>
-          <w:color w:val="2E3C4F"/>
-          <w:sz w:val="16"/>
-          <w:szCs w:val="16"/>
-        </w:rPr>
-        <w:t>CNPJ nº 41.640.065/0001-89.</w:t>
-      </w:r>
-    </w:p>
-    <w:p>
-      <w:pPr>
-        <w:pBdr>
-          <w:top w:val="nil"/>
-          <w:left w:val="nil"/>
-          <w:bottom w:val="nil"/>
-          <w:right w:val="nil"/>
-          <w:between w:val="nil"/>
-        </w:pBdr>
-        <w:spacing w:before="240" w:after="240" w:line="240" w:lineRule="auto"/>
+        </w:rPr>
+      </w:pPr>
+      <w:r>
+        <w:rPr>
+          <w:rFonts w:ascii="Roboto" w:eastAsia="Roboto" w:hAnsi="Roboto" w:cs="Roboto"/>
+          <w:b/>
+          <w:bCs/>
+          <w:color w:val="2E3C4F"/>
+          <w:sz w:val="20"/>
+          <w:szCs w:val="20"/>
+        </w:rPr>
+        <w:t>NOTIFICADA:</w:t>
+      </w:r>
+    </w:p>
+    <w:p>
+      <w:pPr>
+        <w:widowControl w:val="0"/>
+        <w:jc w:val="right"/>
+        <w:rPr>
+          <w:rFonts w:ascii="Roboto" w:eastAsia="Roboto" w:hAnsi="Roboto" w:cs="Roboto"/>
+          <w:color w:val="2E3C4F"/>
+          <w:sz w:val="20"/>
+          <w:szCs w:val="20"/>
+        </w:rPr>
+      </w:pPr>
+      <w:r>
+        <w:rPr>
+          <w:rFonts w:ascii="Roboto" w:eastAsia="Roboto" w:hAnsi="Roboto" w:cs="Roboto"/>
+          <w:b/>
+          <w:bCs/>
+          <w:color w:val="2E3C4F"/>
+          <w:sz w:val="20"/>
+          <w:szCs w:val="20"/>
+        </w:rPr>
+        <w:t>SANKHYA S.A</w:t>
+      </w:r>
+      <w:r>
+        <w:rPr>
+          <w:rFonts w:ascii="Roboto" w:eastAsia="Roboto" w:hAnsi="Roboto" w:cs="Roboto"/>
+          <w:b/>
+          <w:bCs/>
+          <w:color w:val="2E3C4F"/>
+          <w:sz w:val="20"/>
+          <w:szCs w:val="20"/>
+        </w:rPr>
+        <w:t>,</w:t>
+      </w:r>
+      <w:r>
+        <w:rPr>
+          <w:rFonts w:ascii="Roboto" w:eastAsia="Roboto" w:hAnsi="Roboto" w:cs="Roboto"/>
+          <w:color w:val="2E3C4F"/>
+          <w:sz w:val="20"/>
+          <w:szCs w:val="20"/>
+        </w:rPr>
+        <w:t xml:space="preserve"> CNPJ sob o nº 26.314.062/0001-61</w:t>
+      </w:r>
+    </w:p>
+    <w:p>
+      <w:pPr>
+        <w:widowControl w:val="0"/>
+        <w:jc w:val="right"/>
+        <w:rPr>
+          <w:rFonts w:ascii="Roboto" w:eastAsia="Roboto" w:hAnsi="Roboto" w:cs="Roboto"/>
+          <w:color w:val="2E3C4F"/>
+          <w:sz w:val="20"/>
+          <w:szCs w:val="20"/>
+        </w:rPr>
+      </w:pPr>
+      <w:r>
+        <w:rPr>
+          <w:rFonts w:ascii="Roboto" w:eastAsia="Roboto" w:hAnsi="Roboto" w:cs="Roboto"/>
+          <w:color w:val="2E3C4F"/>
+          <w:sz w:val="20"/>
+          <w:szCs w:val="20"/>
+        </w:rPr>
+        <w:t xml:space="preserve">Av. Marcos de Freitas Costa, nº 369, Bairro Daniel Fonseca, </w:t>
+      </w:r>
+    </w:p>
+    <w:p>
+      <w:pPr>
+        <w:widowControl w:val="0"/>
+        <w:jc w:val="right"/>
+        <w:rPr>
+          <w:rFonts w:ascii="Roboto" w:eastAsia="Roboto" w:hAnsi="Roboto" w:cs="Roboto"/>
+          <w:color w:val="2E3C4F"/>
+          <w:sz w:val="20"/>
+          <w:szCs w:val="20"/>
+        </w:rPr>
+      </w:pPr>
+      <w:r>
+        <w:rPr>
+          <w:rFonts w:ascii="Roboto" w:eastAsia="Roboto" w:hAnsi="Roboto" w:cs="Roboto"/>
+          <w:color w:val="2E3C4F"/>
+          <w:sz w:val="20"/>
+          <w:szCs w:val="20"/>
+        </w:rPr>
+        <w:t>CEP 38.400-328, Uberlândia/MG.</w:t>
+      </w:r>
+    </w:p>
+    <w:p>
+      <w:pPr>
+        <w:widowControl w:val="0"/>
+        <w:jc w:val="right"/>
+        <w:rPr>
+          <w:rFonts w:ascii="Roboto" w:eastAsia="Roboto" w:hAnsi="Roboto" w:cs="Roboto"/>
+          <w:color w:val="2E3C4F"/>
+          <w:sz w:val="20"/>
+          <w:szCs w:val="20"/>
+        </w:rPr>
+      </w:pPr>
+    </w:p>
+    <w:p>
+      <w:pPr>
+        <w:widowControl w:val="0"/>
+        <w:jc w:val="right"/>
+        <w:rPr>
+          <w:rFonts w:ascii="Roboto" w:eastAsia="Roboto" w:hAnsi="Roboto" w:cs="Roboto"/>
+          <w:color w:val="2E3C4F"/>
+          <w:sz w:val="20"/>
+          <w:szCs w:val="20"/>
+        </w:rPr>
+      </w:pPr>
+    </w:p>
+    <w:p>
+      <w:pPr>
+        <w:widowControl w:val="0"/>
+        <w:jc w:val="right"/>
+        <w:rPr>
+          <w:rFonts w:ascii="Roboto" w:eastAsia="Roboto" w:hAnsi="Roboto" w:cs="Roboto"/>
+          <w:color w:val="2E3C4F"/>
+          <w:sz w:val="20"/>
+          <w:szCs w:val="20"/>
+        </w:rPr>
+      </w:pPr>
+      <w:r>
+        <w:rPr>
+          <w:rFonts w:ascii="Roboto" w:eastAsia="Roboto" w:hAnsi="Roboto" w:cs="Roboto"/>
+          <w:b/>
+          <w:bCs/>
+          <w:color w:val="2E3C4F"/>
+          <w:sz w:val="20"/>
+          <w:szCs w:val="20"/>
+        </w:rPr>
+        <w:t>NOTIFICANTE:</w:t>
+      </w:r>
+    </w:p>
+    <w:p>
+      <w:pPr>
+        <w:widowControl w:val="0"/>
+        <w:jc w:val="right"/>
+        <w:rPr>
+          <w:rFonts w:ascii="Roboto" w:eastAsia="Roboto" w:hAnsi="Roboto" w:cs="Roboto"/>
+          <w:color w:val="2E3C4F"/>
+          <w:sz w:val="20"/>
+          <w:szCs w:val="20"/>
+        </w:rPr>
+      </w:pPr>
+      <w:r>
+        <w:rPr>
+          <w:rFonts w:ascii="Roboto" w:eastAsia="Roboto" w:hAnsi="Roboto" w:cs="Roboto"/>
+          <w:b/>
+          <w:bCs/>
+          <w:color w:val="2E3C4F"/>
+          <w:sz w:val="20"/>
+          <w:szCs w:val="20"/>
+        </w:rPr>
+        <w:t>BUQ CARE LTDA.</w:t>
+      </w:r>
+      <w:r>
+        <w:rPr>
+          <w:rFonts w:ascii="Roboto" w:eastAsia="Roboto" w:hAnsi="Roboto" w:cs="Roboto"/>
+          <w:color w:val="2E3C4F"/>
+          <w:sz w:val="20"/>
+          <w:szCs w:val="20"/>
+        </w:rPr>
+        <w:t xml:space="preserve">, CNPJ sob o nº 19.877.300/0001-81, </w:t>
+      </w:r>
+    </w:p>
+    <w:p>
+      <w:pPr>
+        <w:widowControl w:val="0"/>
+        <w:jc w:val="right"/>
+        <w:rPr>
+          <w:rFonts w:ascii="Roboto" w:eastAsia="Roboto" w:hAnsi="Roboto" w:cs="Roboto"/>
+          <w:color w:val="2E3C4F"/>
+          <w:sz w:val="20"/>
+          <w:szCs w:val="20"/>
+        </w:rPr>
+      </w:pPr>
+      <w:r>
+        <w:rPr>
+          <w:rFonts w:ascii="Roboto" w:eastAsia="Roboto" w:hAnsi="Roboto" w:cs="Roboto"/>
+          <w:color w:val="2E3C4F"/>
+          <w:sz w:val="20"/>
+          <w:szCs w:val="20"/>
+        </w:rPr>
+        <w:t xml:space="preserve">BR 116, nº 2.555, Módulo 17, Parque Iracema, </w:t>
+      </w:r>
+    </w:p>
+    <w:p>
+      <w:pPr>
+        <w:widowControl w:val="0"/>
+        <w:jc w:val="right"/>
+        <w:rPr>
+          <w:rFonts w:ascii="Roboto" w:eastAsia="Roboto" w:hAnsi="Roboto" w:cs="Roboto"/>
+          <w:color w:val="2E3C4F"/>
+          <w:sz w:val="24"/>
+          <w:szCs w:val="24"/>
+        </w:rPr>
+      </w:pPr>
+      <w:r>
+        <w:rPr>
+          <w:rFonts w:ascii="Roboto" w:eastAsia="Roboto" w:hAnsi="Roboto" w:cs="Roboto"/>
+          <w:color w:val="2E3C4F"/>
+          <w:sz w:val="20"/>
+          <w:szCs w:val="20"/>
+        </w:rPr>
+        <w:t>Fortaleza/CE, CEP 60.824-115.</w:t>
+      </w:r>
+    </w:p>
+    <w:p>
+      <w:pPr>
+        <w:widowControl w:val="0"/>
+        <w:rPr>
+          <w:rFonts w:ascii="Roboto" w:eastAsia="Roboto" w:hAnsi="Roboto" w:cs="Roboto"/>
+          <w:color w:val="2E3C4F"/>
+          <w:sz w:val="24"/>
+          <w:szCs w:val="24"/>
+        </w:rPr>
+      </w:pPr>
+    </w:p>
+    <w:p>
+      <w:pPr>
+        <w:widowControl w:val="0"/>
+        <w:rPr>
+          <w:rFonts w:ascii="Roboto" w:eastAsia="Roboto" w:hAnsi="Roboto" w:cs="Roboto"/>
+          <w:color w:val="2E3C4F"/>
+          <w:sz w:val="24"/>
+          <w:szCs w:val="24"/>
+        </w:rPr>
+      </w:pPr>
+    </w:p>
+    <w:p>
+      <w:pPr>
+        <w:widowControl w:val="0"/>
         <w:jc w:val="both"/>
         <w:rPr>
           <w:rFonts w:ascii="Roboto" w:eastAsia="Roboto" w:hAnsi="Roboto" w:cs="Roboto"/>
@@ -291,23 +300,125 @@
       <w:r>
         <w:rPr>
           <w:rFonts w:ascii="Roboto" w:eastAsia="Roboto" w:hAnsi="Roboto" w:cs="Roboto"/>
-          <w:color w:val="2E3C4F"/>
-          <w:sz w:val="24"/>
-          <w:szCs w:val="24"/>
-        </w:rPr>
-        <w:t>Prezados,</w:t>
-      </w:r>
-    </w:p>
-    <w:p>
-      <w:pPr>
-        <w:pBdr>
-          <w:top w:val="nil"/>
-          <w:left w:val="nil"/>
-          <w:bottom w:val="nil"/>
-          <w:right w:val="nil"/>
-          <w:between w:val="nil"/>
-        </w:pBdr>
-        <w:spacing w:before="240" w:after="240"/>
+          <w:b/>
+          <w:bCs/>
+          <w:color w:val="2E3C4F"/>
+          <w:sz w:val="24"/>
+          <w:szCs w:val="24"/>
+        </w:rPr>
+        <w:t>Referência:</w:t>
+      </w:r>
+      <w:r>
+        <w:rPr>
+          <w:rFonts w:ascii="Roboto" w:eastAsia="Roboto" w:hAnsi="Roboto" w:cs="Roboto"/>
+          <w:color w:val="2E3C4F"/>
+          <w:sz w:val="24"/>
+          <w:szCs w:val="24"/>
+        </w:rPr>
+        <w:t xml:space="preserve"> Notificação Extrajudicial relativa à Proposta Comercial de Licença de Uso firmada com a </w:t>
+      </w:r>
+      <w:r>
+        <w:rPr>
+          <w:rFonts w:ascii="Roboto" w:eastAsia="Roboto" w:hAnsi="Roboto" w:cs="Roboto"/>
+          <w:b/>
+          <w:bCs/>
+          <w:color w:val="2E3C4F"/>
+          <w:sz w:val="24"/>
+          <w:szCs w:val="24"/>
+        </w:rPr>
+        <w:t xml:space="preserve">Sankhya </w:t>
+      </w:r>
+      <w:r>
+        <w:rPr>
+          <w:rFonts w:ascii="Roboto" w:eastAsia="Roboto" w:hAnsi="Roboto" w:cs="Roboto"/>
+          <w:b/>
+          <w:bCs/>
+          <w:color w:val="2E3C4F"/>
+          <w:sz w:val="24"/>
+          <w:szCs w:val="24"/>
+        </w:rPr>
+        <w:t>S.A</w:t>
+      </w:r>
+      <w:r>
+        <w:rPr>
+          <w:rFonts w:ascii="Roboto" w:eastAsia="Roboto" w:hAnsi="Roboto" w:cs="Roboto"/>
+          <w:b/>
+          <w:bCs/>
+          <w:color w:val="2E3C4F"/>
+          <w:sz w:val="24"/>
+          <w:szCs w:val="24"/>
+        </w:rPr>
+        <w:t>.</w:t>
+      </w:r>
+      <w:r>
+        <w:rPr>
+          <w:rFonts w:ascii="Roboto" w:eastAsia="Roboto" w:hAnsi="Roboto" w:cs="Roboto"/>
+          <w:color w:val="2E3C4F"/>
+          <w:sz w:val="24"/>
+          <w:szCs w:val="24"/>
+        </w:rPr>
+        <w:t xml:space="preserve"> e à Proposta Comercial de Implantação nº 12.533, firmada com a </w:t>
+      </w:r>
+      <w:r>
+        <w:rPr>
+          <w:rFonts w:ascii="Roboto" w:eastAsia="Roboto" w:hAnsi="Roboto" w:cs="Roboto"/>
+          <w:b/>
+          <w:bCs/>
+          <w:color w:val="2E3C4F"/>
+          <w:sz w:val="24"/>
+          <w:szCs w:val="24"/>
+        </w:rPr>
+        <w:t>Sailor Soluções em Tecnologia da Informação Ltda.</w:t>
+      </w:r>
+    </w:p>
+    <w:p>
+      <w:pPr>
+        <w:widowControl w:val="0"/>
+        <w:rPr>
+          <w:rFonts w:ascii="Roboto" w:eastAsia="Roboto" w:hAnsi="Roboto" w:cs="Roboto"/>
+          <w:color w:val="2E3C4F"/>
+          <w:sz w:val="24"/>
+          <w:szCs w:val="24"/>
+        </w:rPr>
+      </w:pPr>
+    </w:p>
+    <w:p>
+      <w:pPr>
+        <w:widowControl w:val="0"/>
+        <w:jc w:val="center"/>
+        <w:rPr>
+          <w:rFonts w:ascii="Roboto" w:eastAsia="Roboto" w:hAnsi="Roboto" w:cs="Roboto"/>
+          <w:color w:val="2E3C4F"/>
+          <w:sz w:val="24"/>
+          <w:szCs w:val="24"/>
+        </w:rPr>
+      </w:pPr>
+      <w:r>
+        <w:rPr>
+          <w:rFonts w:ascii="Roboto" w:eastAsia="Roboto" w:hAnsi="Roboto" w:cs="Roboto"/>
+          <w:b/>
+          <w:bCs/>
+          <w:color w:val="2E3C4F"/>
+          <w:sz w:val="24"/>
+          <w:szCs w:val="24"/>
+        </w:rPr>
+        <w:t>1. Resumo da Notificação</w:t>
+      </w:r>
+    </w:p>
+    <w:p>
+      <w:pPr>
+        <w:widowControl w:val="0"/>
+        <w:rPr>
+          <w:rFonts w:ascii="Roboto" w:eastAsia="Roboto" w:hAnsi="Roboto" w:cs="Roboto"/>
+          <w:color w:val="2E3C4F"/>
+          <w:sz w:val="24"/>
+          <w:szCs w:val="24"/>
+        </w:rPr>
+      </w:pPr>
+    </w:p>
+    <w:p>
+      <w:pPr>
+        <w:widowControl w:val="0"/>
         <w:jc w:val="both"/>
         <w:rPr>
           <w:rFonts w:ascii="Roboto" w:eastAsia="Roboto" w:hAnsi="Roboto" w:cs="Roboto"/>
@@ -323,12 +434,107 @@
           <w:sz w:val="24"/>
           <w:szCs w:val="24"/>
         </w:rPr>
-        <w:t>A presente tem por finalidade responder à Notificação Extrajudicial recebida, para prestar os devidos esclarecimentos sobre o contrato de licenciamento de uso do sistema Sankhya OM.</w:t>
-      </w:r>
-    </w:p>
-    <w:p>
-      <w:pPr>
-        <w:spacing w:before="240" w:after="240"/>
+        <w:t xml:space="preserve">A </w:t>
+      </w:r>
+      <w:r>
+        <w:rPr>
+          <w:rFonts w:ascii="Roboto" w:eastAsia="Roboto" w:hAnsi="Roboto" w:cs="Roboto"/>
+          <w:b/>
+          <w:bCs/>
+          <w:color w:val="2E3C4F"/>
+          <w:sz w:val="24"/>
+          <w:szCs w:val="24"/>
+        </w:rPr>
+        <w:t xml:space="preserve">BUQ </w:t>
+      </w:r>
+      <w:proofErr w:type="spellStart"/>
+      <w:r>
+        <w:rPr>
+          <w:rFonts w:ascii="Roboto" w:eastAsia="Roboto" w:hAnsi="Roboto" w:cs="Roboto"/>
+          <w:b/>
+          <w:bCs/>
+          <w:color w:val="2E3C4F"/>
+          <w:sz w:val="24"/>
+          <w:szCs w:val="24"/>
+        </w:rPr>
+        <w:t>Care</w:t>
+      </w:r>
+      <w:proofErr w:type="spellEnd"/>
+      <w:r>
+        <w:rPr>
+          <w:rFonts w:ascii="Roboto" w:eastAsia="Roboto" w:hAnsi="Roboto" w:cs="Roboto"/>
+          <w:b/>
+          <w:bCs/>
+          <w:color w:val="2E3C4F"/>
+          <w:sz w:val="24"/>
+          <w:szCs w:val="24"/>
+        </w:rPr>
+        <w:t xml:space="preserve"> Ltda.</w:t>
+      </w:r>
+      <w:r>
+        <w:rPr>
+          <w:rFonts w:ascii="Roboto" w:eastAsia="Roboto" w:hAnsi="Roboto" w:cs="Roboto"/>
+          <w:color w:val="2E3C4F"/>
+          <w:sz w:val="24"/>
+          <w:szCs w:val="24"/>
+        </w:rPr>
+        <w:t xml:space="preserve"> encaminhou notificação extrajudicial por meio da qual alega que, após aproximadamente oito meses da contratação dos serviços de licença de uso da plataforma Sankhya OM e de implantação do sistema, este último não teria atingido fase operacional, com falhas persistentes de integração e ausência de cronograma formal, o que a impediria de executar até mesmo funções básicas como o lançamento de notas fiscais. Com fundamento na teoria da coligação contratual, na frustração do fim contratual e na suposta responsabilidade solidária da cadeia de fornecimento, a notificante declara a resolução do contrato de implantação com a </w:t>
+      </w:r>
+      <w:r>
+        <w:rPr>
+          <w:rFonts w:ascii="Roboto" w:eastAsia="Roboto" w:hAnsi="Roboto" w:cs="Roboto"/>
+          <w:b/>
+          <w:bCs/>
+          <w:color w:val="2E3C4F"/>
+          <w:sz w:val="24"/>
+          <w:szCs w:val="24"/>
+        </w:rPr>
+        <w:t>Sailor Soluções</w:t>
+      </w:r>
+      <w:r>
+        <w:rPr>
+          <w:rFonts w:ascii="Roboto" w:eastAsia="Roboto" w:hAnsi="Roboto" w:cs="Roboto"/>
+          <w:color w:val="2E3C4F"/>
+          <w:sz w:val="24"/>
+          <w:szCs w:val="24"/>
+        </w:rPr>
+        <w:t xml:space="preserve"> e exige que a </w:t>
+      </w:r>
+      <w:r>
+        <w:rPr>
+          <w:rFonts w:ascii="Roboto" w:eastAsia="Roboto" w:hAnsi="Roboto" w:cs="Roboto"/>
+          <w:b/>
+          <w:bCs/>
+          <w:color w:val="2E3C4F"/>
+          <w:sz w:val="24"/>
+          <w:szCs w:val="24"/>
+        </w:rPr>
+        <w:t>Sankhya</w:t>
+      </w:r>
+      <w:r>
+        <w:rPr>
+          <w:rFonts w:ascii="Roboto" w:eastAsia="Roboto" w:hAnsi="Roboto" w:cs="Roboto"/>
+          <w:color w:val="2E3C4F"/>
+          <w:sz w:val="24"/>
+          <w:szCs w:val="24"/>
+        </w:rPr>
+        <w:t xml:space="preserve"> reconheça, em cinco dias, a resolução da Proposta Comercial de Licença de Uso, cesse qualquer cobrança, abstenha-se de negativar seu nome, proceda à eliminação de dados nos termos da LGPD e reserve o direito de pleitear a restituição dos valores pagos.</w:t>
+      </w:r>
+    </w:p>
+    <w:p>
+      <w:pPr>
+        <w:widowControl w:val="0"/>
+        <w:rPr>
+          <w:rFonts w:ascii="Roboto" w:eastAsia="Roboto" w:hAnsi="Roboto" w:cs="Roboto"/>
+          <w:color w:val="2E3C4F"/>
+          <w:sz w:val="24"/>
+          <w:szCs w:val="24"/>
+        </w:rPr>
+      </w:pPr>
+    </w:p>
+    <w:p>
+      <w:pPr>
+        <w:widowControl w:val="0"/>
         <w:jc w:val="both"/>
         <w:rPr>
           <w:rFonts w:ascii="Roboto" w:eastAsia="Roboto" w:hAnsi="Roboto" w:cs="Roboto"/>
@@ -344,12 +550,77 @@
           <w:sz w:val="24"/>
           <w:szCs w:val="24"/>
         </w:rPr>
-        <w:t>Em primeiro lugar, é necessário refutar veementemente a alegação de falhas ou instabilidade nos serviços prestados. O sistema, desde sua implantação, opera de acordo com os padrões técnicos e a qualidade esperada para um software B2B, sendo que eventuais intercorrências, naturais a qualquer software de mercado, foram devidamente tratadas pela equipe de suporte técnico e resolvidas em estrita conformidade com as cláusulas contratuais.</w:t>
-      </w:r>
-    </w:p>
-    <w:p>
-      <w:pPr>
-        <w:spacing w:before="240" w:after="240"/>
+        <w:t xml:space="preserve">A </w:t>
+      </w:r>
+      <w:r>
+        <w:rPr>
+          <w:rFonts w:ascii="Roboto" w:eastAsia="Roboto" w:hAnsi="Roboto" w:cs="Roboto"/>
+          <w:b/>
+          <w:bCs/>
+          <w:color w:val="2E3C4F"/>
+          <w:sz w:val="24"/>
+          <w:szCs w:val="24"/>
+        </w:rPr>
+        <w:t>Sankhya</w:t>
+      </w:r>
+      <w:r>
+        <w:rPr>
+          <w:rFonts w:ascii="Roboto" w:eastAsia="Roboto" w:hAnsi="Roboto" w:cs="Roboto"/>
+          <w:color w:val="2E3C4F"/>
+          <w:sz w:val="24"/>
+          <w:szCs w:val="24"/>
+        </w:rPr>
+        <w:t xml:space="preserve"> recebeu a notificação, analisou detidamente os seus fundamentos e, pela presente, manifesta sua posição de forma fundamentada.</w:t>
+      </w:r>
+    </w:p>
+    <w:p>
+      <w:pPr>
+        <w:widowControl w:val="0"/>
+        <w:rPr>
+          <w:rFonts w:ascii="Roboto" w:eastAsia="Roboto" w:hAnsi="Roboto" w:cs="Roboto"/>
+          <w:color w:val="2E3C4F"/>
+          <w:sz w:val="24"/>
+          <w:szCs w:val="24"/>
+        </w:rPr>
+      </w:pPr>
+    </w:p>
+    <w:p>
+      <w:pPr>
+        <w:widowControl w:val="0"/>
+        <w:jc w:val="center"/>
+        <w:rPr>
+          <w:rFonts w:ascii="Roboto" w:eastAsia="Roboto" w:hAnsi="Roboto" w:cs="Roboto"/>
+          <w:color w:val="2E3C4F"/>
+          <w:sz w:val="24"/>
+          <w:szCs w:val="24"/>
+        </w:rPr>
+      </w:pPr>
+      <w:r>
+        <w:rPr>
+          <w:rFonts w:ascii="Roboto" w:eastAsia="Roboto" w:hAnsi="Roboto" w:cs="Roboto"/>
+          <w:b/>
+          <w:bCs/>
+          <w:color w:val="2E3C4F"/>
+          <w:sz w:val="24"/>
+          <w:szCs w:val="24"/>
+        </w:rPr>
+        <w:t>2. Dos Fatos</w:t>
+      </w:r>
+    </w:p>
+    <w:p>
+      <w:pPr>
+        <w:widowControl w:val="0"/>
+        <w:rPr>
+          <w:rFonts w:ascii="Roboto" w:eastAsia="Roboto" w:hAnsi="Roboto" w:cs="Roboto"/>
+          <w:color w:val="2E3C4F"/>
+          <w:sz w:val="24"/>
+          <w:szCs w:val="24"/>
+        </w:rPr>
+      </w:pPr>
+    </w:p>
+    <w:p>
+      <w:pPr>
+        <w:widowControl w:val="0"/>
         <w:jc w:val="both"/>
         <w:rPr>
           <w:rFonts w:ascii="Roboto" w:eastAsia="Roboto" w:hAnsi="Roboto" w:cs="Roboto"/>
@@ -365,12 +636,34 @@
           <w:sz w:val="24"/>
           <w:szCs w:val="24"/>
         </w:rPr>
-        <w:t>No que tange à solicitação de readequação contratual e à valoração da proposta de redução de mensalidade, é fundamental esclarecer que a contratação original foi precificada com base no escopo acordado, condições comerciais especiais e descontos concedidos à época. O valor do licenciamento de software e os serviços correlatos refletem a complexidade, a infraestrutura e os custos de manutenção e suporte do software como um todo, e não apenas o número de licenças ativas em um dado momento.</w:t>
-      </w:r>
-    </w:p>
-    <w:p>
-      <w:pPr>
-        <w:spacing w:before="240" w:after="240"/>
+        <w:t>Inicialmente, é necessário contextualizar a relação contratual estabelecida entre as partes para que os argumentos apresentados pela notificante sejam apreciados com a precisão que a matéria exige.</w:t>
+      </w:r>
+    </w:p>
+    <w:p>
+      <w:pPr>
+        <w:widowControl w:val="0"/>
+        <w:rPr>
+          <w:rFonts w:ascii="Roboto" w:eastAsia="Roboto" w:hAnsi="Roboto" w:cs="Roboto"/>
+          <w:color w:val="2E3C4F"/>
+          <w:sz w:val="24"/>
+          <w:szCs w:val="24"/>
+        </w:rPr>
+      </w:pPr>
+    </w:p>
+    <w:p>
+      <w:pPr>
+        <w:widowControl w:val="0"/>
+        <w:rPr>
+          <w:rFonts w:ascii="Roboto" w:eastAsia="Roboto" w:hAnsi="Roboto" w:cs="Roboto"/>
+          <w:color w:val="2E3C4F"/>
+          <w:sz w:val="24"/>
+          <w:szCs w:val="24"/>
+        </w:rPr>
+      </w:pPr>
+    </w:p>
+    <w:p>
+      <w:pPr>
+        <w:widowControl w:val="0"/>
         <w:jc w:val="both"/>
         <w:rPr>
           <w:rFonts w:ascii="Roboto" w:eastAsia="Roboto" w:hAnsi="Roboto" w:cs="Roboto"/>
@@ -386,12 +679,143 @@
           <w:sz w:val="24"/>
           <w:szCs w:val="24"/>
         </w:rPr>
-        <w:t xml:space="preserve">A proposta comercial assinada entre as Partes não prevê a possibilidade de redução de escopo ou de licenças, tampouco a revisão do valor da prestação em razão de alteração na estrutura de utilização. A política de precificação de licenciamento é prerrogativa exclusiva da Sankhya, e não está sujeita à ingerência da Contratante, pois é baseada em uma estrutura de custos, modelo de negócio e condições comerciais. </w:t>
-      </w:r>
-    </w:p>
-    <w:p>
-      <w:pPr>
-        <w:spacing w:before="240" w:after="240"/>
+        <w:t xml:space="preserve">Em 09 de setembro de 2025, foram firmados dois instrumentos distintos: a Proposta Comercial de Licença de Uso do Sankhya OM, celebrada entre </w:t>
+      </w:r>
+      <w:r>
+        <w:rPr>
+          <w:rFonts w:ascii="Roboto" w:eastAsia="Roboto" w:hAnsi="Roboto" w:cs="Roboto"/>
+          <w:b/>
+          <w:bCs/>
+          <w:color w:val="2E3C4F"/>
+          <w:sz w:val="24"/>
+          <w:szCs w:val="24"/>
+        </w:rPr>
+        <w:t>BUQ Care Ltda.</w:t>
+      </w:r>
+      <w:r>
+        <w:rPr>
+          <w:rFonts w:ascii="Roboto" w:eastAsia="Roboto" w:hAnsi="Roboto" w:cs="Roboto"/>
+          <w:color w:val="2E3C4F"/>
+          <w:sz w:val="24"/>
+          <w:szCs w:val="24"/>
+        </w:rPr>
+        <w:t xml:space="preserve">, </w:t>
+      </w:r>
+      <w:r>
+        <w:rPr>
+          <w:rFonts w:ascii="Roboto" w:eastAsia="Roboto" w:hAnsi="Roboto" w:cs="Roboto"/>
+          <w:b/>
+          <w:bCs/>
+          <w:color w:val="2E3C4F"/>
+          <w:sz w:val="24"/>
+          <w:szCs w:val="24"/>
+        </w:rPr>
+        <w:t>Sankhya Jiva Tecnologia e Inovação Ltda.</w:t>
+      </w:r>
+      <w:r>
+        <w:rPr>
+          <w:rFonts w:ascii="Roboto" w:eastAsia="Roboto" w:hAnsi="Roboto" w:cs="Roboto"/>
+          <w:color w:val="2E3C4F"/>
+          <w:sz w:val="24"/>
+          <w:szCs w:val="24"/>
+        </w:rPr>
+        <w:t xml:space="preserve"> e </w:t>
+      </w:r>
+      <w:r>
+        <w:rPr>
+          <w:rFonts w:ascii="Roboto" w:eastAsia="Roboto" w:hAnsi="Roboto" w:cs="Roboto"/>
+          <w:b/>
+          <w:bCs/>
+          <w:color w:val="2E3C4F"/>
+          <w:sz w:val="24"/>
+          <w:szCs w:val="24"/>
+        </w:rPr>
+        <w:t>Asis Taxtech S.A.</w:t>
+      </w:r>
+      <w:r>
+        <w:rPr>
+          <w:rFonts w:ascii="Roboto" w:eastAsia="Roboto" w:hAnsi="Roboto" w:cs="Roboto"/>
+          <w:color w:val="2E3C4F"/>
+          <w:sz w:val="24"/>
+          <w:szCs w:val="24"/>
+        </w:rPr>
+        <w:t xml:space="preserve"> na qualidade de licenciantes, e a Proposta Comercial de Implantação nº 12.533, cujo objeto é exclusivamente a prestação de serviços de implantação, conduzida pela </w:t>
+      </w:r>
+      <w:r>
+        <w:rPr>
+          <w:rFonts w:ascii="Roboto" w:eastAsia="Roboto" w:hAnsi="Roboto" w:cs="Roboto"/>
+          <w:b/>
+          <w:bCs/>
+          <w:color w:val="2E3C4F"/>
+          <w:sz w:val="24"/>
+          <w:szCs w:val="24"/>
+        </w:rPr>
+        <w:t>Sailor Soluções em Tecnologia da Informação Ltda.</w:t>
+      </w:r>
+      <w:r>
+        <w:rPr>
+          <w:rFonts w:ascii="Roboto" w:eastAsia="Roboto" w:hAnsi="Roboto" w:cs="Roboto"/>
+          <w:color w:val="2E3C4F"/>
+          <w:sz w:val="24"/>
+          <w:szCs w:val="24"/>
+        </w:rPr>
+        <w:t xml:space="preserve"> Os contratos envolvem partes distintas, com obrigações específicas e independentes, e nenhum deles contém cláusula expressa de coligação que atribua responsabilidade solidária automática à </w:t>
+      </w:r>
+      <w:r>
+        <w:rPr>
+          <w:rFonts w:ascii="Roboto" w:eastAsia="Roboto" w:hAnsi="Roboto" w:cs="Roboto"/>
+          <w:b/>
+          <w:bCs/>
+          <w:color w:val="2E3C4F"/>
+          <w:sz w:val="24"/>
+          <w:szCs w:val="24"/>
+        </w:rPr>
+        <w:t>Sankhya Jiva</w:t>
+      </w:r>
+      <w:r>
+        <w:rPr>
+          <w:rFonts w:ascii="Roboto" w:eastAsia="Roboto" w:hAnsi="Roboto" w:cs="Roboto"/>
+          <w:color w:val="2E3C4F"/>
+          <w:sz w:val="24"/>
+          <w:szCs w:val="24"/>
+        </w:rPr>
+        <w:t xml:space="preserve"> por atos ou omissões imputáveis à </w:t>
+      </w:r>
+      <w:r>
+        <w:rPr>
+          <w:rFonts w:ascii="Roboto" w:eastAsia="Roboto" w:hAnsi="Roboto" w:cs="Roboto"/>
+          <w:b/>
+          <w:bCs/>
+          <w:color w:val="2E3C4F"/>
+          <w:sz w:val="24"/>
+          <w:szCs w:val="24"/>
+        </w:rPr>
+        <w:t>Sailor</w:t>
+      </w:r>
+      <w:r>
+        <w:rPr>
+          <w:rFonts w:ascii="Roboto" w:eastAsia="Roboto" w:hAnsi="Roboto" w:cs="Roboto"/>
+          <w:color w:val="2E3C4F"/>
+          <w:sz w:val="24"/>
+          <w:szCs w:val="24"/>
+        </w:rPr>
+        <w:t>.</w:t>
+      </w:r>
+    </w:p>
+    <w:p>
+      <w:pPr>
+        <w:widowControl w:val="0"/>
+        <w:rPr>
+          <w:rFonts w:ascii="Roboto" w:eastAsia="Roboto" w:hAnsi="Roboto" w:cs="Roboto"/>
+          <w:color w:val="2E3C4F"/>
+          <w:sz w:val="24"/>
+          <w:szCs w:val="24"/>
+        </w:rPr>
+      </w:pPr>
+    </w:p>
+    <w:p>
+      <w:pPr>
+        <w:widowControl w:val="0"/>
         <w:jc w:val="both"/>
         <w:rPr>
           <w:rFonts w:ascii="Roboto" w:eastAsia="Roboto" w:hAnsi="Roboto" w:cs="Roboto"/>
@@ -407,7 +831,191 @@
           <w:sz w:val="24"/>
           <w:szCs w:val="24"/>
         </w:rPr>
-        <w:t xml:space="preserve">Nesse sentido, a oferta de redução do valor mensal, embora não contratualmente devida, foi uma demonstração de mera liberalidade e de boa-fé comercial por parte da Sankhya, visando a manutenção do bom relacionamento. A proposta de redução se alinha a essa </w:t>
+        <w:t xml:space="preserve">A notificante sustenta que os instrumentos seriam indissociáveis e que a eventual falha na implantação deveria contaminar a licença de uso. Ocorre que tal tese não encontra amparo nos documentos firmados. A Proposta Comercial de Licença de Uso define com clareza o objeto da </w:t>
+      </w:r>
+      <w:r>
+        <w:rPr>
+          <w:rFonts w:ascii="Roboto" w:eastAsia="Roboto" w:hAnsi="Roboto" w:cs="Roboto"/>
+          <w:b/>
+          <w:bCs/>
+          <w:color w:val="2E3C4F"/>
+          <w:sz w:val="24"/>
+          <w:szCs w:val="24"/>
+        </w:rPr>
+        <w:t>Sankhya Jiva</w:t>
+      </w:r>
+      <w:r>
+        <w:rPr>
+          <w:rFonts w:ascii="Roboto" w:eastAsia="Roboto" w:hAnsi="Roboto" w:cs="Roboto"/>
+          <w:color w:val="2E3C4F"/>
+          <w:sz w:val="24"/>
+          <w:szCs w:val="24"/>
+        </w:rPr>
+        <w:t xml:space="preserve">: disponibilizar o acesso à plataforma Sankhya OM, o que foi integralmente cumprido desde a contratação. A obrigação de licenciar o software é autônoma em relação à execução dos serviços de implantação, que incumbem exclusivamente à </w:t>
+      </w:r>
+      <w:r>
+        <w:rPr>
+          <w:rFonts w:ascii="Roboto" w:eastAsia="Roboto" w:hAnsi="Roboto" w:cs="Roboto"/>
+          <w:b/>
+          <w:bCs/>
+          <w:color w:val="2E3C4F"/>
+          <w:sz w:val="24"/>
+          <w:szCs w:val="24"/>
+        </w:rPr>
+        <w:t>Sailor</w:t>
+      </w:r>
+      <w:r>
+        <w:rPr>
+          <w:rFonts w:ascii="Roboto" w:eastAsia="Roboto" w:hAnsi="Roboto" w:cs="Roboto"/>
+          <w:color w:val="2E3C4F"/>
+          <w:sz w:val="24"/>
+          <w:szCs w:val="24"/>
+        </w:rPr>
+        <w:t>. A coligação contratual, quando reconhecida pela jurisprudência, pressupõe nexo funcional entre os contratos capaz de justificar a extensão dos efeitos resolutivos, o que não se verifica pela simples presença de um mesmo objeto de negócio subjacente quando as partes, as obrigações e os riscos são deliberadamente segregados em instrumentos distintos.</w:t>
+      </w:r>
+    </w:p>
+    <w:p>
+      <w:pPr>
+        <w:widowControl w:val="0"/>
+        <w:rPr>
+          <w:rFonts w:ascii="Roboto" w:eastAsia="Roboto" w:hAnsi="Roboto" w:cs="Roboto"/>
+          <w:color w:val="2E3C4F"/>
+          <w:sz w:val="24"/>
+          <w:szCs w:val="24"/>
+        </w:rPr>
+      </w:pPr>
+    </w:p>
+    <w:p>
+      <w:pPr>
+        <w:widowControl w:val="0"/>
+        <w:jc w:val="both"/>
+        <w:rPr>
+          <w:rFonts w:ascii="Roboto" w:eastAsia="Roboto" w:hAnsi="Roboto" w:cs="Roboto"/>
+          <w:color w:val="2E3C4F"/>
+          <w:sz w:val="24"/>
+          <w:szCs w:val="24"/>
+        </w:rPr>
+      </w:pPr>
+      <w:r>
+        <w:rPr>
+          <w:rFonts w:ascii="Roboto" w:eastAsia="Roboto" w:hAnsi="Roboto" w:cs="Roboto"/>
+          <w:color w:val="2E3C4F"/>
+          <w:sz w:val="24"/>
+          <w:szCs w:val="24"/>
+        </w:rPr>
+        <w:t xml:space="preserve">No mérito dos fatos alegados, a afirmação de que o projeto não teria apresentado qualquer evolução operacional em oito meses não corresponde ao histórico documentado da implantação. Entre outubro e janeiro de 2026 foram realizadas as etapas de validação de escopo, parametrização via Deploy e configurações adicionais do sistema. A partir de fevereiro e março de 2026 foram conduzidas agendas de treinamento dos usuários e validação dos processos definidos pela própria </w:t>
+      </w:r>
+      <w:r>
+        <w:rPr>
+          <w:rFonts w:ascii="Roboto" w:eastAsia="Roboto" w:hAnsi="Roboto" w:cs="Roboto"/>
+          <w:b/>
+          <w:bCs/>
+          <w:color w:val="2E3C4F"/>
+          <w:sz w:val="24"/>
+          <w:szCs w:val="24"/>
+        </w:rPr>
+        <w:t>BUQ Care</w:t>
+      </w:r>
+      <w:r>
+        <w:rPr>
+          <w:rFonts w:ascii="Roboto" w:eastAsia="Roboto" w:hAnsi="Roboto" w:cs="Roboto"/>
+          <w:color w:val="2E3C4F"/>
+          <w:sz w:val="24"/>
+          <w:szCs w:val="24"/>
+        </w:rPr>
+        <w:t>. Nos meses de março e abril de 2026 o projeto avançou para as etapas de validação operacional e simulações integradas dos processos, o que representa estágio avançado de maturidade na implantação de um ERP da complexidade do Sankhya OM.</w:t>
+      </w:r>
+    </w:p>
+    <w:p>
+      <w:pPr>
+        <w:widowControl w:val="0"/>
+        <w:rPr>
+          <w:rFonts w:ascii="Roboto" w:eastAsia="Roboto" w:hAnsi="Roboto" w:cs="Roboto"/>
+          <w:color w:val="2E3C4F"/>
+          <w:sz w:val="24"/>
+          <w:szCs w:val="24"/>
+        </w:rPr>
+      </w:pPr>
+    </w:p>
+    <w:p>
+      <w:pPr>
+        <w:widowControl w:val="0"/>
+        <w:jc w:val="both"/>
+        <w:rPr>
+          <w:rFonts w:ascii="Roboto" w:eastAsia="Roboto" w:hAnsi="Roboto" w:cs="Roboto"/>
+          <w:color w:val="2E3C4F"/>
+          <w:sz w:val="24"/>
+          <w:szCs w:val="24"/>
+        </w:rPr>
+      </w:pPr>
+      <w:r>
+        <w:rPr>
+          <w:rFonts w:ascii="Roboto" w:eastAsia="Roboto" w:hAnsi="Roboto" w:cs="Roboto"/>
+          <w:color w:val="2E3C4F"/>
+          <w:sz w:val="24"/>
+          <w:szCs w:val="24"/>
+        </w:rPr>
+        <w:t xml:space="preserve">Ao longo da execução, é fato documentado que determinadas atividades foram impactadas pela falta de envio, em tempo hábil, de informações complementares, definições operacionais e validações por parte da própria </w:t>
+      </w:r>
+      <w:r>
+        <w:rPr>
+          <w:rFonts w:ascii="Roboto" w:eastAsia="Roboto" w:hAnsi="Roboto" w:cs="Roboto"/>
+          <w:b/>
+          <w:bCs/>
+          <w:color w:val="2E3C4F"/>
+          <w:sz w:val="24"/>
+          <w:szCs w:val="24"/>
+        </w:rPr>
+        <w:t>BUQ Care</w:t>
+      </w:r>
+      <w:r>
+        <w:rPr>
+          <w:rFonts w:ascii="Roboto" w:eastAsia="Roboto" w:hAnsi="Roboto" w:cs="Roboto"/>
+          <w:color w:val="2E3C4F"/>
+          <w:sz w:val="24"/>
+          <w:szCs w:val="24"/>
+        </w:rPr>
+        <w:t xml:space="preserve">, o que gerou a necessidade de replanejamento de agendas e readequação das etapas subsequentes. Tal situação configura, ao menos em parte, mora do credor, afastando qualquer alegação de inadimplemento exclusivo por parte da </w:t>
+      </w:r>
+      <w:r>
+        <w:rPr>
+          <w:rFonts w:ascii="Roboto" w:eastAsia="Roboto" w:hAnsi="Roboto" w:cs="Roboto"/>
+          <w:b/>
+          <w:bCs/>
+          <w:color w:val="2E3C4F"/>
+          <w:sz w:val="24"/>
+          <w:szCs w:val="24"/>
+        </w:rPr>
+        <w:t>Sankhya</w:t>
+      </w:r>
+      <w:r>
+        <w:rPr>
+          <w:rFonts w:ascii="Roboto" w:eastAsia="Roboto" w:hAnsi="Roboto" w:cs="Roboto"/>
+          <w:color w:val="2E3C4F"/>
+          <w:sz w:val="24"/>
+          <w:szCs w:val="24"/>
+        </w:rPr>
+        <w:t xml:space="preserve"> ou da </w:t>
+      </w:r>
+      <w:r>
+        <w:rPr>
+          <w:rFonts w:ascii="Roboto" w:eastAsia="Roboto" w:hAnsi="Roboto" w:cs="Roboto"/>
+          <w:b/>
+          <w:bCs/>
+          <w:color w:val="2E3C4F"/>
+          <w:sz w:val="24"/>
+          <w:szCs w:val="24"/>
+        </w:rPr>
+        <w:t>Sailor</w:t>
+      </w:r>
+      <w:r>
+        <w:rPr>
+          <w:rFonts w:ascii="Roboto" w:eastAsia="Roboto" w:hAnsi="Roboto" w:cs="Roboto"/>
+          <w:color w:val="2E3C4F"/>
+          <w:sz w:val="24"/>
+          <w:szCs w:val="24"/>
+        </w:rPr>
+        <w:t xml:space="preserve">. Além disso, foram </w:t>
       </w:r>
       <w:r>
         <w:rPr>
@@ -417,12 +1025,43 @@
           <w:szCs w:val="24"/>
         </w:rPr>
         <w:lastRenderedPageBreak/>
-        <w:t>liberalidade, considerando as condições especiais do contrato inicial e o escopo que permanece em uso.</w:t>
-      </w:r>
-    </w:p>
-    <w:p>
-      <w:pPr>
-        <w:spacing w:before="240" w:after="240"/>
+        <w:t xml:space="preserve">identificadas ocorrências sistêmicas que demandaram atuação conjunta com a equipe de Service Desk e integrações conduzidas por fornecedores terceiros indicados pela própria </w:t>
+      </w:r>
+      <w:r>
+        <w:rPr>
+          <w:rFonts w:ascii="Roboto" w:eastAsia="Roboto" w:hAnsi="Roboto" w:cs="Roboto"/>
+          <w:b/>
+          <w:bCs/>
+          <w:color w:val="2E3C4F"/>
+          <w:sz w:val="24"/>
+          <w:szCs w:val="24"/>
+        </w:rPr>
+        <w:t>BUQ Care</w:t>
+      </w:r>
+      <w:r>
+        <w:rPr>
+          <w:rFonts w:ascii="Roboto" w:eastAsia="Roboto" w:hAnsi="Roboto" w:cs="Roboto"/>
+          <w:color w:val="2E3C4F"/>
+          <w:sz w:val="24"/>
+          <w:szCs w:val="24"/>
+        </w:rPr>
+        <w:t>, fatores que contribuíram para o prolongamento de determinadas entregas sem que isso possa ser atribuído a inércia dos fornecedores do sistema.</w:t>
+      </w:r>
+    </w:p>
+    <w:p>
+      <w:pPr>
+        <w:widowControl w:val="0"/>
+        <w:rPr>
+          <w:rFonts w:ascii="Roboto" w:eastAsia="Roboto" w:hAnsi="Roboto" w:cs="Roboto"/>
+          <w:color w:val="2E3C4F"/>
+          <w:sz w:val="24"/>
+          <w:szCs w:val="24"/>
+        </w:rPr>
+      </w:pPr>
+    </w:p>
+    <w:p>
+      <w:pPr>
+        <w:widowControl w:val="0"/>
         <w:jc w:val="both"/>
         <w:rPr>
           <w:rFonts w:ascii="Roboto" w:eastAsia="Roboto" w:hAnsi="Roboto" w:cs="Roboto"/>
@@ -438,12 +1077,63 @@
           <w:sz w:val="24"/>
           <w:szCs w:val="24"/>
         </w:rPr>
-        <w:t>Ademais, não se aplicam ao presente caso os artigos 478 a 480 do Código Civil, que tratam da resolução ou revisão de contrato por onerosidade excessiva. A jurisprudência dominante e a doutrina exigem, para a aplicação de tais artigos, a ocorrência de um evento "extraordinário e imprevisível" que, além de tornar a prestação excessivamente onerosa para uma das partes, gere "extrema vantagem" para a outra. A mera redução de atividades operacionais ou uma conjuntura econômica desfavorável não se enquadram nesses requisitos, pois são riscos inerentes a qualquer atividade empresarial. A Sankhya não obteve e nem obterá "extrema vantagem" com a manutenção do contrato, pois a infraestrutura e a disponibilidade do serviço continuam a ser prestadas.</w:t>
-      </w:r>
-    </w:p>
-    <w:p>
-      <w:pPr>
-        <w:spacing w:before="240" w:after="240"/>
+        <w:t xml:space="preserve">Nesse sentido, a afirmação de que o sistema seria completamente inútil e que funções básicas como o lançamento de notas fiscais estariam impossibilitadas é incompatível com o nível de evolução atingido no projeto, que chegou à fase de simulações integradas. A </w:t>
+      </w:r>
+      <w:r>
+        <w:rPr>
+          <w:rFonts w:ascii="Roboto" w:eastAsia="Roboto" w:hAnsi="Roboto" w:cs="Roboto"/>
+          <w:b/>
+          <w:bCs/>
+          <w:color w:val="2E3C4F"/>
+          <w:sz w:val="24"/>
+          <w:szCs w:val="24"/>
+        </w:rPr>
+        <w:t>Sankhya</w:t>
+      </w:r>
+      <w:r>
+        <w:rPr>
+          <w:rFonts w:ascii="Roboto" w:eastAsia="Roboto" w:hAnsi="Roboto" w:cs="Roboto"/>
+          <w:color w:val="2E3C4F"/>
+          <w:sz w:val="24"/>
+          <w:szCs w:val="24"/>
+        </w:rPr>
+        <w:t xml:space="preserve"> disponibilizou a plataforma de forma contínua, que demandou da </w:t>
+      </w:r>
+      <w:r>
+        <w:rPr>
+          <w:rFonts w:ascii="Roboto" w:eastAsia="Roboto" w:hAnsi="Roboto" w:cs="Roboto"/>
+          <w:b/>
+          <w:bCs/>
+          <w:color w:val="2E3C4F"/>
+          <w:sz w:val="24"/>
+          <w:szCs w:val="24"/>
+        </w:rPr>
+        <w:t>BUQ Care</w:t>
+      </w:r>
+      <w:r>
+        <w:rPr>
+          <w:rFonts w:ascii="Roboto" w:eastAsia="Roboto" w:hAnsi="Roboto" w:cs="Roboto"/>
+          <w:color w:val="2E3C4F"/>
+          <w:sz w:val="24"/>
+          <w:szCs w:val="24"/>
+        </w:rPr>
+        <w:t xml:space="preserve"> atividades de parametrização, treinamento e integração durante todos os meses de execução.</w:t>
+      </w:r>
+    </w:p>
+    <w:p>
+      <w:pPr>
+        <w:widowControl w:val="0"/>
+        <w:rPr>
+          <w:rFonts w:ascii="Roboto" w:eastAsia="Roboto" w:hAnsi="Roboto" w:cs="Roboto"/>
+          <w:color w:val="2E3C4F"/>
+          <w:sz w:val="24"/>
+          <w:szCs w:val="24"/>
+        </w:rPr>
+      </w:pPr>
+    </w:p>
+    <w:p>
+      <w:pPr>
+        <w:widowControl w:val="0"/>
         <w:jc w:val="both"/>
         <w:rPr>
           <w:rFonts w:ascii="Roboto" w:eastAsia="Roboto" w:hAnsi="Roboto" w:cs="Roboto"/>
@@ -459,12 +1149,63 @@
           <w:sz w:val="24"/>
           <w:szCs w:val="24"/>
         </w:rPr>
-        <w:t>Diante do exposto, reiteramos que a proposta apresentada reflete uma concessão/liberalidade e não uma obrigação contratual ou legal. Não existem cláusulas que imponham as limitações mencionadas na notificação, pois as regras de precificação e licenciamento foram estabelecidas na Proposta Comercial assinada no momento da contratação. Não há, portanto, que se falar em apresentação de dispositivos contratuais que não existem.</w:t>
-      </w:r>
-    </w:p>
-    <w:p>
-      <w:pPr>
-        <w:spacing w:before="240" w:after="240"/>
+        <w:t xml:space="preserve">A notificante menciona também a aplicabilidade do Código de Defesa do Consumidor e a suposta responsabilidade solidária da cadeia de fornecimento com fundamento nos arts. 7º, 18 e 25 do CDC. A </w:t>
+      </w:r>
+      <w:r>
+        <w:rPr>
+          <w:rFonts w:ascii="Roboto" w:eastAsia="Roboto" w:hAnsi="Roboto" w:cs="Roboto"/>
+          <w:b/>
+          <w:bCs/>
+          <w:color w:val="2E3C4F"/>
+          <w:sz w:val="24"/>
+          <w:szCs w:val="24"/>
+        </w:rPr>
+        <w:t>Sankhya</w:t>
+      </w:r>
+      <w:r>
+        <w:rPr>
+          <w:rFonts w:ascii="Roboto" w:eastAsia="Roboto" w:hAnsi="Roboto" w:cs="Roboto"/>
+          <w:color w:val="2E3C4F"/>
+          <w:sz w:val="24"/>
+          <w:szCs w:val="24"/>
+        </w:rPr>
+        <w:t xml:space="preserve"> registra que a </w:t>
+      </w:r>
+      <w:r>
+        <w:rPr>
+          <w:rFonts w:ascii="Roboto" w:eastAsia="Roboto" w:hAnsi="Roboto" w:cs="Roboto"/>
+          <w:b/>
+          <w:bCs/>
+          <w:color w:val="2E3C4F"/>
+          <w:sz w:val="24"/>
+          <w:szCs w:val="24"/>
+        </w:rPr>
+        <w:t>BUQ Care Ltda.</w:t>
+      </w:r>
+      <w:r>
+        <w:rPr>
+          <w:rFonts w:ascii="Roboto" w:eastAsia="Roboto" w:hAnsi="Roboto" w:cs="Roboto"/>
+          <w:color w:val="2E3C4F"/>
+          <w:sz w:val="24"/>
+          <w:szCs w:val="24"/>
+        </w:rPr>
+        <w:t xml:space="preserve"> é pessoa jurídica que contratou uma plataforma ERP para uso direto em sua atividade empresarial, o que, conforme entendimento consolidado da jurisprudência do Superior Tribunal de Justiça, afasta a caracterização da hipossuficiência técnica e econômica inerente à relação de consumo. Tratando-se de relação empresarial paritária, a incidência do CDC e, por conseguinte, da responsabilidade solidária nele prevista, não é aplicável ao presente caso.</w:t>
+      </w:r>
+    </w:p>
+    <w:p>
+      <w:pPr>
+        <w:widowControl w:val="0"/>
+        <w:rPr>
+          <w:rFonts w:ascii="Roboto" w:eastAsia="Roboto" w:hAnsi="Roboto" w:cs="Roboto"/>
+          <w:color w:val="2E3C4F"/>
+          <w:sz w:val="24"/>
+          <w:szCs w:val="24"/>
+        </w:rPr>
+      </w:pPr>
+    </w:p>
+    <w:p>
+      <w:pPr>
+        <w:widowControl w:val="0"/>
         <w:jc w:val="both"/>
         <w:rPr>
           <w:rFonts w:ascii="Roboto" w:eastAsia="Roboto" w:hAnsi="Roboto" w:cs="Roboto"/>
@@ -480,12 +1221,43 @@
           <w:sz w:val="24"/>
           <w:szCs w:val="24"/>
         </w:rPr>
-        <w:t>A SANKHYA reafirma seu interesse em manter a relação contratual em bases transparentes e respeitosas, contudo, é imperioso que ambas as partes observem os termos livremente pactuados.</w:t>
-      </w:r>
-    </w:p>
-    <w:p>
-      <w:pPr>
-        <w:spacing w:before="240" w:after="240" w:line="240" w:lineRule="auto"/>
+        <w:t xml:space="preserve">Quanto ao pedido de resolução contratual com fundamento no art. 478 do Código Civil, que disciplina a resolução por onerosidade excessiva superveniente, tampouco prospera a alegação. O dispositivo exige que a prestação de uma das partes se torne excessivamente onerosa em razão de acontecimento extraordinário e imprevisível, o que não é o caso. A licença de uso foi contratada a um valor fixo mensal de R$ 14.088,39, em condições conhecidas e aceitas pela notificante no ato da assinatura, sem que tenha havido qualquer alteração das circunstâncias econômicas do contrato que justifique a aplicação da cláusula resolutiva por onerosidade excessiva. O simples fato de a implantação ter se prolongado além do inicialmente esperado, parcialmente por razões imputáveis à própria </w:t>
+      </w:r>
+      <w:r>
+        <w:rPr>
+          <w:rFonts w:ascii="Roboto" w:eastAsia="Roboto" w:hAnsi="Roboto" w:cs="Roboto"/>
+          <w:b/>
+          <w:bCs/>
+          <w:color w:val="2E3C4F"/>
+          <w:sz w:val="24"/>
+          <w:szCs w:val="24"/>
+        </w:rPr>
+        <w:t>BUQ Care</w:t>
+      </w:r>
+      <w:r>
+        <w:rPr>
+          <w:rFonts w:ascii="Roboto" w:eastAsia="Roboto" w:hAnsi="Roboto" w:cs="Roboto"/>
+          <w:color w:val="2E3C4F"/>
+          <w:sz w:val="24"/>
+          <w:szCs w:val="24"/>
+        </w:rPr>
+        <w:t>, não configura o suporte fático do art. 478.</w:t>
+      </w:r>
+    </w:p>
+    <w:p>
+      <w:pPr>
+        <w:widowControl w:val="0"/>
+        <w:rPr>
+          <w:rFonts w:ascii="Roboto" w:eastAsia="Roboto" w:hAnsi="Roboto" w:cs="Roboto"/>
+          <w:color w:val="2E3C4F"/>
+          <w:sz w:val="24"/>
+          <w:szCs w:val="24"/>
+        </w:rPr>
+      </w:pPr>
+    </w:p>
+    <w:p>
+      <w:pPr>
+        <w:widowControl w:val="0"/>
         <w:jc w:val="both"/>
         <w:rPr>
           <w:rFonts w:ascii="Roboto" w:eastAsia="Roboto" w:hAnsi="Roboto" w:cs="Roboto"/>
@@ -494,10 +1266,50 @@
           <w:szCs w:val="24"/>
         </w:rPr>
       </w:pPr>
-    </w:p>
-    <w:p>
-      <w:pPr>
-        <w:spacing w:before="240" w:after="240" w:line="240" w:lineRule="auto"/>
+      <w:r>
+        <w:rPr>
+          <w:rFonts w:ascii="Roboto" w:eastAsia="Roboto" w:hAnsi="Roboto" w:cs="Roboto"/>
+          <w:color w:val="2E3C4F"/>
+          <w:sz w:val="24"/>
+          <w:szCs w:val="24"/>
+        </w:rPr>
+        <w:t xml:space="preserve">A </w:t>
+      </w:r>
+      <w:r>
+        <w:rPr>
+          <w:rFonts w:ascii="Roboto" w:eastAsia="Roboto" w:hAnsi="Roboto" w:cs="Roboto"/>
+          <w:b/>
+          <w:bCs/>
+          <w:color w:val="2E3C4F"/>
+          <w:sz w:val="24"/>
+          <w:szCs w:val="24"/>
+        </w:rPr>
+        <w:t>Sankhya</w:t>
+      </w:r>
+      <w:r>
+        <w:rPr>
+          <w:rFonts w:ascii="Roboto" w:eastAsia="Roboto" w:hAnsi="Roboto" w:cs="Roboto"/>
+          <w:color w:val="2E3C4F"/>
+          <w:sz w:val="24"/>
+          <w:szCs w:val="24"/>
+        </w:rPr>
+        <w:t xml:space="preserve"> registra ainda que a própria notificante declarou que efetuará o pagamento da fatura de maio de 2026, o que confirma que, até a data desta notificação, a licença estava sendo utilizada e disponibilizada regularmente, afastando a tese de inutilidade absoluta do sistema e reforçando a existência de relação contratual válida e em vigor.</w:t>
+      </w:r>
+    </w:p>
+    <w:p>
+      <w:pPr>
+        <w:widowControl w:val="0"/>
+        <w:rPr>
+          <w:rFonts w:ascii="Roboto" w:eastAsia="Roboto" w:hAnsi="Roboto" w:cs="Roboto"/>
+          <w:color w:val="2E3C4F"/>
+          <w:sz w:val="24"/>
+          <w:szCs w:val="24"/>
+        </w:rPr>
+      </w:pPr>
+    </w:p>
+    <w:p>
+      <w:pPr>
+        <w:widowControl w:val="0"/>
         <w:jc w:val="both"/>
         <w:rPr>
           <w:rFonts w:ascii="Roboto" w:eastAsia="Roboto" w:hAnsi="Roboto" w:cs="Roboto"/>
@@ -513,12 +1325,107 @@
           <w:sz w:val="24"/>
           <w:szCs w:val="24"/>
         </w:rPr>
-        <w:t>Atenciosamente,</w:t>
-      </w:r>
-    </w:p>
-    <w:p>
-      <w:pPr>
-        <w:spacing w:before="240" w:after="240" w:line="240" w:lineRule="auto"/>
+        <w:t xml:space="preserve">Por fim, a </w:t>
+      </w:r>
+      <w:r>
+        <w:rPr>
+          <w:rFonts w:ascii="Roboto" w:eastAsia="Roboto" w:hAnsi="Roboto" w:cs="Roboto"/>
+          <w:b/>
+          <w:bCs/>
+          <w:color w:val="2E3C4F"/>
+          <w:sz w:val="24"/>
+          <w:szCs w:val="24"/>
+        </w:rPr>
+        <w:t>Sankhya</w:t>
+      </w:r>
+      <w:r>
+        <w:rPr>
+          <w:rFonts w:ascii="Roboto" w:eastAsia="Roboto" w:hAnsi="Roboto" w:cs="Roboto"/>
+          <w:color w:val="2E3C4F"/>
+          <w:sz w:val="24"/>
+          <w:szCs w:val="24"/>
+        </w:rPr>
+        <w:t xml:space="preserve"> não reconhece a resolução unilateral da Proposta Comercial de Licença de Uso pretendida pela notificante, tampouco aceita como válidos os fundamentos </w:t>
+      </w:r>
+      <w:r>
+        <w:rPr>
+          <w:rFonts w:ascii="Roboto" w:eastAsia="Roboto" w:hAnsi="Roboto" w:cs="Roboto"/>
+          <w:color w:val="2E3C4F"/>
+          <w:sz w:val="24"/>
+          <w:szCs w:val="24"/>
+        </w:rPr>
+        <w:lastRenderedPageBreak/>
+        <w:t xml:space="preserve">jurídicos invocados para tanto. O prazo de cinco dias fixado na notificação é manifestamente desproporcional à complexidade da matéria e à seriedade das consequências pleiteadas, razão pela qual a presente resposta, entregue dentro de prazo contratual avençado, representa o posicionamento definitivo e fundamentado da </w:t>
+      </w:r>
+      <w:r>
+        <w:rPr>
+          <w:rFonts w:ascii="Roboto" w:eastAsia="Roboto" w:hAnsi="Roboto" w:cs="Roboto"/>
+          <w:b/>
+          <w:bCs/>
+          <w:color w:val="2E3C4F"/>
+          <w:sz w:val="24"/>
+          <w:szCs w:val="24"/>
+        </w:rPr>
+        <w:t>Sankhya</w:t>
+      </w:r>
+      <w:r>
+        <w:rPr>
+          <w:rFonts w:ascii="Roboto" w:eastAsia="Roboto" w:hAnsi="Roboto" w:cs="Roboto"/>
+          <w:color w:val="2E3C4F"/>
+          <w:sz w:val="24"/>
+          <w:szCs w:val="24"/>
+        </w:rPr>
+        <w:t xml:space="preserve"> sobre todos os pontos levantados.</w:t>
+      </w:r>
+    </w:p>
+    <w:p>
+      <w:pPr>
+        <w:widowControl w:val="0"/>
+        <w:rPr>
+          <w:rFonts w:ascii="Roboto" w:eastAsia="Roboto" w:hAnsi="Roboto" w:cs="Roboto"/>
+          <w:color w:val="2E3C4F"/>
+          <w:sz w:val="24"/>
+          <w:szCs w:val="24"/>
+        </w:rPr>
+      </w:pPr>
+    </w:p>
+    <w:p>
+      <w:pPr>
+        <w:widowControl w:val="0"/>
+        <w:jc w:val="center"/>
+        <w:rPr>
+          <w:rFonts w:ascii="Roboto" w:eastAsia="Roboto" w:hAnsi="Roboto" w:cs="Roboto"/>
+          <w:color w:val="2E3C4F"/>
+          <w:sz w:val="24"/>
+          <w:szCs w:val="24"/>
+        </w:rPr>
+      </w:pPr>
+      <w:r>
+        <w:rPr>
+          <w:rFonts w:ascii="Roboto" w:eastAsia="Roboto" w:hAnsi="Roboto" w:cs="Roboto"/>
+          <w:b/>
+          <w:bCs/>
+          <w:color w:val="2E3C4F"/>
+          <w:sz w:val="24"/>
+          <w:szCs w:val="24"/>
+        </w:rPr>
+        <w:t>Considerações Finais e Proposta de Solução</w:t>
+      </w:r>
+    </w:p>
+    <w:p>
+      <w:pPr>
+        <w:widowControl w:val="0"/>
+        <w:rPr>
+          <w:rFonts w:ascii="Roboto" w:eastAsia="Roboto" w:hAnsi="Roboto" w:cs="Roboto"/>
+          <w:color w:val="2E3C4F"/>
+          <w:sz w:val="24"/>
+          <w:szCs w:val="24"/>
+        </w:rPr>
+      </w:pPr>
+    </w:p>
+    <w:p>
+      <w:pPr>
+        <w:widowControl w:val="0"/>
         <w:jc w:val="both"/>
         <w:rPr>
           <w:rFonts w:ascii="Roboto" w:eastAsia="Roboto" w:hAnsi="Roboto" w:cs="Roboto"/>
@@ -527,10 +1434,90 @@
           <w:szCs w:val="24"/>
         </w:rPr>
       </w:pPr>
-    </w:p>
-    <w:p>
-      <w:pPr>
-        <w:spacing w:before="240" w:after="240" w:line="240" w:lineRule="auto"/>
+      <w:r>
+        <w:rPr>
+          <w:rFonts w:ascii="Roboto" w:eastAsia="Roboto" w:hAnsi="Roboto" w:cs="Roboto"/>
+          <w:color w:val="2E3C4F"/>
+          <w:sz w:val="24"/>
+          <w:szCs w:val="24"/>
+        </w:rPr>
+        <w:t xml:space="preserve">A </w:t>
+      </w:r>
+      <w:r>
+        <w:rPr>
+          <w:rFonts w:ascii="Roboto" w:eastAsia="Roboto" w:hAnsi="Roboto" w:cs="Roboto"/>
+          <w:b/>
+          <w:bCs/>
+          <w:color w:val="2E3C4F"/>
+          <w:sz w:val="24"/>
+          <w:szCs w:val="24"/>
+        </w:rPr>
+        <w:t>Sankhya</w:t>
+      </w:r>
+      <w:r>
+        <w:rPr>
+          <w:rFonts w:ascii="Roboto" w:eastAsia="Roboto" w:hAnsi="Roboto" w:cs="Roboto"/>
+          <w:color w:val="2E3C4F"/>
+          <w:sz w:val="24"/>
+          <w:szCs w:val="24"/>
+        </w:rPr>
+        <w:t xml:space="preserve"> rejeita os pedidos formulados na notificação extrajudicial nos termos em que apresentados, por não encontrarem amparo fático nem jurídico nas circunstâncias do caso. O histórico do projeto demonstra que os serviços foram prestados com dedicação e que a fase operacional não foi atingida no prazo esperado, ao menos em parte, por fatores relacionados à própria </w:t>
+      </w:r>
+      <w:r>
+        <w:rPr>
+          <w:rFonts w:ascii="Roboto" w:eastAsia="Roboto" w:hAnsi="Roboto" w:cs="Roboto"/>
+          <w:b/>
+          <w:bCs/>
+          <w:color w:val="2E3C4F"/>
+          <w:sz w:val="24"/>
+          <w:szCs w:val="24"/>
+        </w:rPr>
+        <w:t>BUQ Care</w:t>
+      </w:r>
+      <w:r>
+        <w:rPr>
+          <w:rFonts w:ascii="Roboto" w:eastAsia="Roboto" w:hAnsi="Roboto" w:cs="Roboto"/>
+          <w:color w:val="2E3C4F"/>
+          <w:sz w:val="24"/>
+          <w:szCs w:val="24"/>
+        </w:rPr>
+        <w:t xml:space="preserve">, o que afasta qualquer reconhecimento de inadimplemento exclusivo por parte da </w:t>
+      </w:r>
+      <w:r>
+        <w:rPr>
+          <w:rFonts w:ascii="Roboto" w:eastAsia="Roboto" w:hAnsi="Roboto" w:cs="Roboto"/>
+          <w:b/>
+          <w:bCs/>
+          <w:color w:val="2E3C4F"/>
+          <w:sz w:val="24"/>
+          <w:szCs w:val="24"/>
+        </w:rPr>
+        <w:t>Sankhya Jiva</w:t>
+      </w:r>
+      <w:r>
+        <w:rPr>
+          <w:rFonts w:ascii="Roboto" w:eastAsia="Roboto" w:hAnsi="Roboto" w:cs="Roboto"/>
+          <w:color w:val="2E3C4F"/>
+          <w:sz w:val="24"/>
+          <w:szCs w:val="24"/>
+        </w:rPr>
+        <w:t>.</w:t>
+      </w:r>
+    </w:p>
+    <w:p>
+      <w:pPr>
+        <w:widowControl w:val="0"/>
+        <w:rPr>
+          <w:rFonts w:ascii="Roboto" w:eastAsia="Roboto" w:hAnsi="Roboto" w:cs="Roboto"/>
+          <w:color w:val="2E3C4F"/>
+          <w:sz w:val="24"/>
+          <w:szCs w:val="24"/>
+        </w:rPr>
+      </w:pPr>
+    </w:p>
+    <w:p>
+      <w:pPr>
+        <w:widowControl w:val="0"/>
         <w:jc w:val="both"/>
         <w:rPr>
           <w:rFonts w:ascii="Roboto" w:eastAsia="Roboto" w:hAnsi="Roboto" w:cs="Roboto"/>
@@ -539,38 +1526,169 @@
           <w:szCs w:val="24"/>
         </w:rPr>
       </w:pPr>
-    </w:p>
-    <w:p>
-      <w:pPr>
-        <w:widowControl w:val="0"/>
-        <w:ind w:right="-432"/>
-        <w:rPr>
-          <w:rFonts w:ascii="Roboto" w:eastAsia="Roboto" w:hAnsi="Roboto" w:cs="Roboto"/>
-          <w:color w:val="2E3C4F"/>
-          <w:sz w:val="24"/>
-          <w:szCs w:val="24"/>
-        </w:rPr>
-      </w:pPr>
-      <w:r>
-        <w:rPr>
-          <w:rFonts w:ascii="Roboto" w:eastAsia="Roboto" w:hAnsi="Roboto" w:cs="Roboto"/>
-          <w:b/>
-          <w:bCs/>
-          <w:color w:val="2E3C4F"/>
-          <w:sz w:val="24"/>
-          <w:szCs w:val="24"/>
-        </w:rPr>
-        <w:t>SANKHYA JIVA TECNOLOGIA E INOVAÇÃO LTDA.</w:t>
-      </w:r>
-    </w:p>
-    <w:p>
-      <w:pPr>
-        <w:widowControl w:val="0"/>
-        <w:ind w:right="-432"/>
-        <w:rPr>
-          <w:rFonts w:ascii="Roboto" w:eastAsia="Roboto" w:hAnsi="Roboto" w:cs="Roboto"/>
-          <w:b/>
-          <w:bCs/>
+      <w:r>
+        <w:rPr>
+          <w:rFonts w:ascii="Roboto" w:eastAsia="Roboto" w:hAnsi="Roboto" w:cs="Roboto"/>
+          <w:color w:val="2E3C4F"/>
+          <w:sz w:val="24"/>
+          <w:szCs w:val="24"/>
+        </w:rPr>
+        <w:t xml:space="preserve">Não obstante, a </w:t>
+      </w:r>
+      <w:r>
+        <w:rPr>
+          <w:rFonts w:ascii="Roboto" w:eastAsia="Roboto" w:hAnsi="Roboto" w:cs="Roboto"/>
+          <w:b/>
+          <w:bCs/>
+          <w:color w:val="2E3C4F"/>
+          <w:sz w:val="24"/>
+          <w:szCs w:val="24"/>
+        </w:rPr>
+        <w:t>Sankhya</w:t>
+      </w:r>
+      <w:r>
+        <w:rPr>
+          <w:rFonts w:ascii="Roboto" w:eastAsia="Roboto" w:hAnsi="Roboto" w:cs="Roboto"/>
+          <w:color w:val="2E3C4F"/>
+          <w:sz w:val="24"/>
+          <w:szCs w:val="24"/>
+        </w:rPr>
+        <w:t xml:space="preserve"> reitera seu compromisso com a satisfação de seus clientes e com a resolução construtiva de situações como a presente. Nesse sentido, a equipe responsável pelo projeto está em contato com a </w:t>
+      </w:r>
+      <w:r>
+        <w:rPr>
+          <w:rFonts w:ascii="Roboto" w:eastAsia="Roboto" w:hAnsi="Roboto" w:cs="Roboto"/>
+          <w:b/>
+          <w:bCs/>
+          <w:color w:val="2E3C4F"/>
+          <w:sz w:val="24"/>
+          <w:szCs w:val="24"/>
+        </w:rPr>
+        <w:t>BUQ Care</w:t>
+      </w:r>
+      <w:r>
+        <w:rPr>
+          <w:rFonts w:ascii="Roboto" w:eastAsia="Roboto" w:hAnsi="Roboto" w:cs="Roboto"/>
+          <w:color w:val="2E3C4F"/>
+          <w:sz w:val="24"/>
+          <w:szCs w:val="24"/>
+        </w:rPr>
+        <w:t xml:space="preserve"> para o agendamento de reunião executiva com o objetivo de avaliar o cenário atual, identificar os pontos pendentes e definir um plano de ação concreto para que o sistema atinja plena operacionalidade no menor prazo possível.</w:t>
+      </w:r>
+    </w:p>
+    <w:p>
+      <w:pPr>
+        <w:widowControl w:val="0"/>
+        <w:rPr>
+          <w:rFonts w:ascii="Roboto" w:eastAsia="Roboto" w:hAnsi="Roboto" w:cs="Roboto"/>
+          <w:color w:val="2E3C4F"/>
+          <w:sz w:val="24"/>
+          <w:szCs w:val="24"/>
+        </w:rPr>
+      </w:pPr>
+    </w:p>
+    <w:p>
+      <w:pPr>
+        <w:widowControl w:val="0"/>
+        <w:jc w:val="both"/>
+        <w:rPr>
+          <w:rFonts w:ascii="Roboto" w:eastAsia="Roboto" w:hAnsi="Roboto" w:cs="Roboto"/>
+          <w:color w:val="2E3C4F"/>
+          <w:sz w:val="24"/>
+          <w:szCs w:val="24"/>
+        </w:rPr>
+      </w:pPr>
+      <w:r>
+        <w:rPr>
+          <w:rFonts w:ascii="Roboto" w:eastAsia="Roboto" w:hAnsi="Roboto" w:cs="Roboto"/>
+          <w:color w:val="2E3C4F"/>
+          <w:sz w:val="24"/>
+          <w:szCs w:val="24"/>
+        </w:rPr>
+        <w:t xml:space="preserve">A </w:t>
+      </w:r>
+      <w:r>
+        <w:rPr>
+          <w:rFonts w:ascii="Roboto" w:eastAsia="Roboto" w:hAnsi="Roboto" w:cs="Roboto"/>
+          <w:b/>
+          <w:bCs/>
+          <w:color w:val="2E3C4F"/>
+          <w:sz w:val="24"/>
+          <w:szCs w:val="24"/>
+        </w:rPr>
+        <w:t>Sankhya</w:t>
+      </w:r>
+      <w:r>
+        <w:rPr>
+          <w:rFonts w:ascii="Roboto" w:eastAsia="Roboto" w:hAnsi="Roboto" w:cs="Roboto"/>
+          <w:color w:val="2E3C4F"/>
+          <w:sz w:val="24"/>
+          <w:szCs w:val="24"/>
+        </w:rPr>
+        <w:t xml:space="preserve"> permanece à disposição para o diálogo e para encontrar, de forma colaborativa, a melhor solução para ambas as partes, preservando a relação contratual e os investimentos já realizados.</w:t>
+      </w:r>
+    </w:p>
+    <w:p>
+      <w:pPr>
+        <w:widowControl w:val="0"/>
+        <w:rPr>
+          <w:rFonts w:ascii="Roboto" w:eastAsia="Roboto" w:hAnsi="Roboto" w:cs="Roboto"/>
+          <w:color w:val="2E3C4F"/>
+          <w:sz w:val="24"/>
+          <w:szCs w:val="24"/>
+        </w:rPr>
+      </w:pPr>
+    </w:p>
+    <w:p>
+      <w:pPr>
+        <w:widowControl w:val="0"/>
+        <w:rPr>
+          <w:rFonts w:ascii="Roboto" w:eastAsia="Roboto" w:hAnsi="Roboto" w:cs="Roboto"/>
+          <w:color w:val="2E3C4F"/>
+          <w:sz w:val="24"/>
+          <w:szCs w:val="24"/>
+        </w:rPr>
+      </w:pPr>
+    </w:p>
+    <w:p>
+      <w:pPr>
+        <w:widowControl w:val="0"/>
+        <w:jc w:val="center"/>
+        <w:rPr>
+          <w:rFonts w:ascii="Roboto" w:eastAsia="Roboto" w:hAnsi="Roboto" w:cs="Roboto"/>
+          <w:color w:val="2E3C4F"/>
+          <w:sz w:val="24"/>
+          <w:szCs w:val="24"/>
+        </w:rPr>
+      </w:pPr>
+      <w:r>
+        <w:rPr>
+          <w:rFonts w:ascii="Roboto" w:eastAsia="Roboto" w:hAnsi="Roboto" w:cs="Roboto"/>
+          <w:b/>
+          <w:bCs/>
+          <w:color w:val="2E3C4F"/>
+          <w:sz w:val="24"/>
+          <w:szCs w:val="24"/>
+        </w:rPr>
+        <w:t>SANKHYA S.A.</w:t>
+      </w:r>
+    </w:p>
+    <w:p>
+      <w:pPr>
+        <w:widowControl w:val="0"/>
+        <w:rPr>
+          <w:rFonts w:ascii="Roboto" w:eastAsia="Roboto" w:hAnsi="Roboto" w:cs="Roboto"/>
+          <w:color w:val="2E3C4F"/>
+          <w:sz w:val="24"/>
+          <w:szCs w:val="24"/>
+        </w:rPr>
+      </w:pPr>
+    </w:p>
+    <w:p>
+      <w:pPr>
+        <w:widowControl w:val="0"/>
+        <w:rPr>
+          <w:rFonts w:ascii="Roboto" w:eastAsia="Roboto" w:hAnsi="Roboto" w:cs="Roboto"/>
           <w:color w:val="2E3C4F"/>
           <w:sz w:val="24"/>
           <w:szCs w:val="24"/>
@@ -581,7 +1699,6 @@
       <w:headerReference w:type="default" r:id="rId6"/>
       <w:footerReference w:type="default" r:id="rId7"/>
       <w:headerReference w:type="first" r:id="rId8"/>
-      <w:footerReference w:type="first" r:id="rId9"/>
       <w:pgSz w:w="11906" w:h="16838"/>
       <w:pgMar w:top="1700" w:right="1133" w:bottom="1417" w:left="1133" w:header="0" w:footer="0" w:gutter="0"/>
       <w:pgNumType w:start="1"/>
@@ -623,12 +1740,6 @@
       <w:ind w:left="-1133" w:right="-1140"/>
     </w:pPr>
   </w:p>
-</w:ftr>
-</file>
-
-<file path=word/footer2.xml><?xml version="1.0" encoding="utf-8"?>
-<w:ftr xmlns:wpc="http://schemas.microsoft.com/office/word/2010/wordprocessingCanvas" xmlns:cx="http://schemas.microsoft.com/office/drawing/2014/chartex" xmlns:cx1="http://schemas.microsoft.com/office/drawing/2015/9/8/chartex" xmlns:cx2="http://schemas.microsoft.com/office/drawing/2015/10/21/chartex" xmlns:cx3="http://schemas.microsoft.com/office/drawing/2016/5/9/chartex" xmlns:cx4="http://schemas.microsoft.com/office/drawing/2016/5/10/chartex" xmlns:cx5="http://schemas.microsoft.com/office/drawing/2016/5/11/chartex" xmlns:cx6="http://schemas.microsoft.com/office/drawing/2016/5/12/chartex" xmlns:cx7="http://schemas.microsoft.com/office/drawing/2016/5/13/chartex" xmlns:cx8="http://schemas.microsoft.com/office/drawing/2016/5/14/chartex" xmlns:mc="http://schemas.openxmlformats.org/markup-compatibility/2006" xmlns:aink="http://schemas.microsoft.com/office/drawing/2016/ink" xmlns:am3d="http://schemas.microsoft.com/office/drawing/2017/model3d" xmlns:o="urn:schemas-microsoft-com:office:office" xmlns:oel="http://schemas.microsoft.com/office/2019/extlst" xmlns:r="http://schemas.openxmlformats.org/officeDocument/2006/relationships" xmlns:m="http://schemas.openxmlformats.org/officeDocument/2006/math" xmlns:v="urn:schemas-microsoft-com:vml" xmlns:wp14="http://schemas.microsoft.com/office/word/2010/wordprocessingDrawing" xmlns:wp="http://schemas.openxmlformats.org/drawingml/2006/wordprocessingDrawing" xmlns:w10="urn:schemas-microsoft-com:office:word" xmlns:w="http://schemas.openxmlformats.org/wordprocessingml/2006/main" xmlns:w14="http://schemas.microsoft.com/office/word/2010/wordml" xmlns:w15="http://schemas.microsoft.com/office/word/2012/wordml" xmlns:w16cex="http://schemas.microsoft.com/office/word/2018/wordml/cex" xmlns:w16cid="http://schemas.microsoft.com/office/word/2016/wordml/cid" xmlns:w16="http://schemas.microsoft.com/office/word/2018/wordml" xmlns:w16du="http://schemas.microsoft.com/office/word/2023/wordml/word16du" xmlns:w16sdtdh="http://schemas.microsoft.com/office/word/2020/wordml/sdtdatahash" xmlns:w16sdtfl="http://schemas.microsoft.com/office/word/2024/wordml/sdtformatlock" xmlns:w16se="http://schemas.microsoft.com/office/word/2015/wordml/symex" xmlns:wpg="http://schemas.microsoft.com/office/word/2010/wordprocessingGroup" xmlns:wpi="http://schemas.microsoft.com/office/word/2010/wordprocessingInk" xmlns:wne="http://schemas.microsoft.com/office/word/2006/wordml" xmlns:wps="http://schemas.microsoft.com/office/word/2010/wordprocessingShape" mc:Ignorable="w14 w15 w16se w16cid w16 w16cex w16sdtdh w16sdtfl w16du wp14">
-  <w:p/>
 </w:ftr>
 </file>
 
@@ -759,32 +1870,6 @@
         <w:shd w:val="clear" w:color="auto" w:fill="2E3C4F"/>
       </w:rPr>
     </w:pPr>
-  </w:p>
-  <w:p>
-    <w:pPr>
-      <w:widowControl w:val="0"/>
-      <w:ind w:left="-425" w:right="-432"/>
-      <w:jc w:val="right"/>
-      <w:rPr>
-        <w:rFonts w:ascii="Roboto" w:eastAsia="Roboto" w:hAnsi="Roboto" w:cs="Roboto"/>
-        <w:b/>
-        <w:bCs/>
-        <w:color w:val="2E3C4F"/>
-        <w:sz w:val="20"/>
-        <w:szCs w:val="20"/>
-      </w:rPr>
-    </w:pPr>
-    <w:r>
-      <w:rPr>
-        <w:rFonts w:ascii="Roboto" w:eastAsia="Roboto" w:hAnsi="Roboto" w:cs="Roboto"/>
-        <w:b/>
-        <w:bCs/>
-        <w:color w:val="2E3C4F"/>
-        <w:sz w:val="20"/>
-        <w:szCs w:val="20"/>
-      </w:rPr>
-      <w:t>Uberlândia/MG, 01 de setembro de 2025.</w:t>
-    </w:r>
   </w:p>
   <w:p>
     <w:pPr>
@@ -1542,6 +2627,50 @@
       <w:szCs w:val="30"/>
     </w:rPr>
   </w:style>
+  <w:style w:type="paragraph" w:styleId="Cabealho">
+    <w:name w:val="header"/>
+    <w:basedOn w:val="Normal"/>
+    <w:link w:val="CabealhoChar"/>
+    <w:uiPriority w:val="99"/>
+    <w:unhideWhenUsed/>
+    <w:rsid w:val="00BB5D18"/>
+    <w:pPr>
+      <w:tabs>
+        <w:tab w:val="center" w:pos="4252"/>
+        <w:tab w:val="right" w:pos="8504"/>
+      </w:tabs>
+      <w:spacing w:line="240" w:lineRule="auto"/>
+    </w:pPr>
+  </w:style>
+  <w:style w:type="character" w:customStyle="1" w:styleId="CabealhoChar">
+    <w:name w:val="Cabeçalho Char"/>
+    <w:basedOn w:val="Fontepargpadro"/>
+    <w:link w:val="Cabealho"/>
+    <w:uiPriority w:val="99"/>
+    <w:rsid w:val="00BB5D18"/>
+  </w:style>
+  <w:style w:type="paragraph" w:styleId="Rodap">
+    <w:name w:val="footer"/>
+    <w:basedOn w:val="Normal"/>
+    <w:link w:val="RodapChar"/>
+    <w:uiPriority w:val="99"/>
+    <w:unhideWhenUsed/>
+    <w:rsid w:val="00BB5D18"/>
+    <w:pPr>
+      <w:tabs>
+        <w:tab w:val="center" w:pos="4252"/>
+        <w:tab w:val="right" w:pos="8504"/>
+      </w:tabs>
+      <w:spacing w:line="240" w:lineRule="auto"/>
+    </w:pPr>
+  </w:style>
+  <w:style w:type="character" w:customStyle="1" w:styleId="RodapChar">
+    <w:name w:val="Rodapé Char"/>
+    <w:basedOn w:val="Fontepargpadro"/>
+    <w:link w:val="Rodap"/>
+    <w:uiPriority w:val="99"/>
+    <w:rsid w:val="00BB5D18"/>
+  </w:style>
 </w:styles>
 </file>
 

</xml_diff>